<commit_message>
Add title and remove warning
</commit_message>
<xml_diff>
--- a/04 - Event/04_Event.docx
+++ b/04 - Event/04_Event.docx
@@ -7,11 +7,33 @@
         <w:pStyle w:val="Title"/>
       </w:pPr>
       <w:r>
-        <w:t xml:space="preserve">survey.knit</w:t>
-      </w:r>
-    </w:p>
-    <w:bookmarkStart w:id="20" w:name="header"/>
+        <w:t xml:space="preserve">Post</w:t>
+      </w:r>
+      <w:r>
+        <w:t xml:space="preserve"> </w:t>
+      </w:r>
+      <w:r>
+        <w:t xml:space="preserve">Event</w:t>
+      </w:r>
+      <w:r>
+        <w:t xml:space="preserve"> </w:t>
+      </w:r>
+      <w:r>
+        <w:t xml:space="preserve">Survey</w:t>
+      </w:r>
+    </w:p>
+    <w:bookmarkStart w:id="21" w:name="header"/>
+    <w:bookmarkStart w:id="20" w:name="post-event-survey"/>
+    <w:p>
+      <w:pPr>
+        <w:pStyle w:val="Heading1"/>
+      </w:pPr>
+      <w:r>
+        <w:t xml:space="preserve">Post Event Survey</w:t>
+      </w:r>
+    </w:p>
     <w:bookmarkEnd w:id="20"/>
+    <w:bookmarkEnd w:id="21"/>
     <w:p>
       <w:pPr>
         <w:pStyle w:val="FirstParagraph"/>
@@ -20,7 +42,7 @@
         <w:t xml:space="preserve">— consentpage</w:t>
       </w:r>
     </w:p>
-    <w:bookmarkStart w:id="33" w:name="instructions-to-participants"/>
+    <w:bookmarkStart w:id="34" w:name="instructions-to-participants"/>
     <w:p>
       <w:pPr>
         <w:pStyle w:val="Heading1"/>
@@ -55,7 +77,7 @@
         <w:t xml:space="preserve">publication and reporting to the NIH.</w:t>
       </w:r>
     </w:p>
-    <w:bookmarkStart w:id="21" w:name="data-confidentiality"/>
+    <w:bookmarkStart w:id="22" w:name="data-confidentiality"/>
     <w:p>
       <w:pPr>
         <w:pStyle w:val="Heading3"/>
@@ -96,8 +118,8 @@
         <w:t xml:space="preserve">information in your written responses.</w:t>
       </w:r>
     </w:p>
-    <w:bookmarkEnd w:id="21"/>
-    <w:bookmarkStart w:id="22" w:name="data-sharing"/>
+    <w:bookmarkEnd w:id="22"/>
+    <w:bookmarkStart w:id="23" w:name="data-sharing"/>
     <w:p>
       <w:pPr>
         <w:pStyle w:val="Heading3"/>
@@ -120,8 +142,8 @@
         <w:t xml:space="preserve">will be shared.</w:t>
       </w:r>
     </w:p>
-    <w:bookmarkEnd w:id="22"/>
-    <w:bookmarkStart w:id="23" w:name="participation"/>
+    <w:bookmarkEnd w:id="23"/>
+    <w:bookmarkStart w:id="24" w:name="participation"/>
     <w:p>
       <w:pPr>
         <w:pStyle w:val="Heading3"/>
@@ -230,8 +252,8 @@
         <w:t xml:space="preserve">to complete.</w:t>
       </w:r>
     </w:p>
-    <w:bookmarkEnd w:id="23"/>
-    <w:bookmarkStart w:id="24" w:name="risk"/>
+    <w:bookmarkEnd w:id="24"/>
+    <w:bookmarkStart w:id="25" w:name="risk"/>
     <w:p>
       <w:pPr>
         <w:pStyle w:val="Heading3"/>
@@ -284,8 +306,8 @@
         <w:t xml:space="preserve">the internet.</w:t>
       </w:r>
     </w:p>
-    <w:bookmarkEnd w:id="24"/>
-    <w:bookmarkStart w:id="25" w:name="consent"/>
+    <w:bookmarkEnd w:id="25"/>
+    <w:bookmarkStart w:id="26" w:name="consent"/>
     <w:p>
       <w:pPr>
         <w:pStyle w:val="Heading3"/>
@@ -322,8 +344,8 @@
         <w:br/>
       </w:r>
     </w:p>
-    <w:bookmarkEnd w:id="25"/>
-    <w:bookmarkStart w:id="29" w:name="questions-or-problems"/>
+    <w:bookmarkEnd w:id="26"/>
+    <w:bookmarkStart w:id="30" w:name="questions-or-problems"/>
     <w:p>
       <w:pPr>
         <w:pStyle w:val="Heading2"/>
@@ -354,7 +376,7 @@
       <w:r>
         <w:t xml:space="preserve"> </w:t>
       </w:r>
-      <w:hyperlink r:id="rId26">
+      <w:hyperlink r:id="rId27">
         <w:r>
           <w:rPr>
             <w:rStyle w:val="Hyperlink"/>
@@ -377,7 +399,7 @@
       <w:r>
         <w:t xml:space="preserve"> </w:t>
       </w:r>
-      <w:hyperlink r:id="rId27">
+      <w:hyperlink r:id="rId28">
         <w:r>
           <w:rPr>
             <w:rStyle w:val="Hyperlink"/>
@@ -492,7 +514,7 @@
       <w:r>
         <w:t xml:space="preserve"> </w:t>
       </w:r>
-      <w:hyperlink r:id="rId28">
+      <w:hyperlink r:id="rId29">
         <w:r>
           <w:rPr>
             <w:rStyle w:val="Hyperlink"/>
@@ -509,8 +531,8 @@
         <w:br/>
       </w:r>
     </w:p>
-    <w:bookmarkEnd w:id="29"/>
-    <w:bookmarkStart w:id="32" w:name="Xfa56f018418faa1935d9022b16b5c93772a40ad"/>
+    <w:bookmarkEnd w:id="30"/>
+    <w:bookmarkStart w:id="33" w:name="Xfa56f018418faa1935d9022b16b5c93772a40ad"/>
     <w:p>
       <w:pPr>
         <w:pStyle w:val="Heading2"/>
@@ -519,8 +541,8 @@
         <w:t xml:space="preserve">Consent for answers to be used by AI-GENe staff</w:t>
       </w:r>
     </w:p>
-    <w:bookmarkStart w:id="31" w:name="container-consent"/>
-    <w:bookmarkStart w:id="30" w:name="consent"/>
+    <w:bookmarkStart w:id="32" w:name="container-consent"/>
+    <w:bookmarkStart w:id="31" w:name="consent"/>
     <w:p>
       <w:pPr>
         <w:pStyle w:val="FirstParagraph"/>
@@ -545,7 +567,7 @@
         <w:t xml:space="preserve">No</w:t>
       </w:r>
     </w:p>
-    <w:bookmarkEnd w:id="30"/>
+    <w:bookmarkEnd w:id="31"/>
     <w:p>
       <w:pPr>
         <w:pStyle w:val="BodyText"/>
@@ -554,7 +576,7 @@
         <w:t xml:space="preserve">*</w:t>
       </w:r>
     </w:p>
-    <w:bookmarkEnd w:id="31"/>
+    <w:bookmarkEnd w:id="32"/>
     <w:p>
       <w:pPr>
         <w:pStyle w:val="BodyText"/>
@@ -571,9 +593,9 @@
         <w:t xml:space="preserve">— participant_information</w:t>
       </w:r>
     </w:p>
-    <w:bookmarkEnd w:id="32"/>
     <w:bookmarkEnd w:id="33"/>
-    <w:bookmarkStart w:id="38" w:name="information-about-you"/>
+    <w:bookmarkEnd w:id="34"/>
+    <w:bookmarkStart w:id="39" w:name="information-about-you"/>
     <w:p>
       <w:pPr>
         <w:pStyle w:val="Heading1"/>
@@ -582,8 +604,8 @@
         <w:t xml:space="preserve">Information about you</w:t>
       </w:r>
     </w:p>
-    <w:bookmarkStart w:id="35" w:name="container-participant_type"/>
-    <w:bookmarkStart w:id="34" w:name="participant_type"/>
+    <w:bookmarkStart w:id="36" w:name="container-participant_type"/>
+    <w:bookmarkStart w:id="35" w:name="participant_type"/>
     <w:p>
       <w:pPr>
         <w:pStyle w:val="FirstParagraph"/>
@@ -624,7 +646,7 @@
         <w:t xml:space="preserve">Other, including wish not to say</w:t>
       </w:r>
     </w:p>
-    <w:bookmarkEnd w:id="34"/>
+    <w:bookmarkEnd w:id="35"/>
     <w:p>
       <w:pPr>
         <w:pStyle w:val="BodyText"/>
@@ -633,9 +655,9 @@
         <w:t xml:space="preserve">*</w:t>
       </w:r>
     </w:p>
-    <w:bookmarkEnd w:id="35"/>
-    <w:bookmarkStart w:id="37" w:name="container-event_attended"/>
-    <w:bookmarkStart w:id="36" w:name="event_attended"/>
+    <w:bookmarkEnd w:id="36"/>
+    <w:bookmarkStart w:id="38" w:name="container-event_attended"/>
+    <w:bookmarkStart w:id="37" w:name="event_attended"/>
     <w:p>
       <w:pPr>
         <w:pStyle w:val="BodyText"/>
@@ -676,7 +698,7 @@
         <w:t xml:space="preserve">Other</w:t>
       </w:r>
     </w:p>
-    <w:bookmarkEnd w:id="36"/>
+    <w:bookmarkEnd w:id="37"/>
     <w:p>
       <w:pPr>
         <w:pStyle w:val="BodyText"/>
@@ -685,7 +707,7 @@
         <w:t xml:space="preserve">*</w:t>
       </w:r>
     </w:p>
-    <w:bookmarkEnd w:id="37"/>
+    <w:bookmarkEnd w:id="38"/>
     <w:p>
       <w:pPr>
         <w:pStyle w:val="BodyText"/>
@@ -702,8 +724,8 @@
         <w:t xml:space="preserve">— educatorpage</w:t>
       </w:r>
     </w:p>
-    <w:bookmarkEnd w:id="38"/>
-    <w:bookmarkStart w:id="54" w:name="your-experience-with-ai-gene"/>
+    <w:bookmarkEnd w:id="39"/>
+    <w:bookmarkStart w:id="55" w:name="your-experience-with-ai-gene"/>
     <w:p>
       <w:pPr>
         <w:pStyle w:val="Heading1"/>
@@ -740,8 +762,8 @@
         <w:t xml:space="preserve">other identifying information in your written responses.</w:t>
       </w:r>
     </w:p>
-    <w:bookmarkStart w:id="40" w:name="container-educator_institution"/>
-    <w:bookmarkStart w:id="39" w:name="educator_institution"/>
+    <w:bookmarkStart w:id="41" w:name="container-educator_institution"/>
+    <w:bookmarkStart w:id="40" w:name="educator_institution"/>
     <w:p>
       <w:pPr>
         <w:pStyle w:val="BodyText"/>
@@ -806,7 +828,7 @@
         <w:t xml:space="preserve">Other</w:t>
       </w:r>
     </w:p>
-    <w:bookmarkEnd w:id="39"/>
+    <w:bookmarkEnd w:id="40"/>
     <w:p>
       <w:pPr>
         <w:pStyle w:val="BodyText"/>
@@ -815,8 +837,8 @@
         <w:t xml:space="preserve">*</w:t>
       </w:r>
     </w:p>
-    <w:bookmarkEnd w:id="40"/>
-    <w:bookmarkStart w:id="41" w:name="container-educator_institution_other"/>
+    <w:bookmarkEnd w:id="41"/>
+    <w:bookmarkStart w:id="42" w:name="container-educator_institution_other"/>
     <w:p>
       <w:pPr>
         <w:pStyle w:val="BodyText"/>
@@ -833,9 +855,9 @@
         <w:t xml:space="preserve">*</w:t>
       </w:r>
     </w:p>
-    <w:bookmarkEnd w:id="41"/>
-    <w:bookmarkStart w:id="43" w:name="container-session_helpfulness"/>
-    <w:bookmarkStart w:id="42" w:name="session_helpfulness"/>
+    <w:bookmarkEnd w:id="42"/>
+    <w:bookmarkStart w:id="44" w:name="container-session_helpfulness"/>
+    <w:bookmarkStart w:id="43" w:name="session_helpfulness"/>
     <w:p>
       <w:pPr>
         <w:pStyle w:val="BodyText"/>
@@ -884,7 +906,7 @@
         <w:t xml:space="preserve">Very helpful (5)</w:t>
       </w:r>
     </w:p>
-    <w:bookmarkEnd w:id="42"/>
+    <w:bookmarkEnd w:id="43"/>
     <w:p>
       <w:pPr>
         <w:pStyle w:val="BodyText"/>
@@ -893,9 +915,9 @@
         <w:t xml:space="preserve">*</w:t>
       </w:r>
     </w:p>
-    <w:bookmarkEnd w:id="43"/>
-    <w:bookmarkStart w:id="45" w:name="container-recommend_materials"/>
-    <w:bookmarkStart w:id="44" w:name="recommend_materials"/>
+    <w:bookmarkEnd w:id="44"/>
+    <w:bookmarkStart w:id="46" w:name="container-recommend_materials"/>
+    <w:bookmarkStart w:id="45" w:name="recommend_materials"/>
     <w:p>
       <w:pPr>
         <w:pStyle w:val="BodyText"/>
@@ -944,7 +966,7 @@
         <w:t xml:space="preserve">Very likely (5)</w:t>
       </w:r>
     </w:p>
-    <w:bookmarkEnd w:id="44"/>
+    <w:bookmarkEnd w:id="45"/>
     <w:p>
       <w:pPr>
         <w:pStyle w:val="BodyText"/>
@@ -953,9 +975,9 @@
         <w:t xml:space="preserve">*</w:t>
       </w:r>
     </w:p>
-    <w:bookmarkEnd w:id="45"/>
-    <w:bookmarkStart w:id="47" w:name="container-facilitator_confidence"/>
-    <w:bookmarkStart w:id="46" w:name="facilitator_confidence"/>
+    <w:bookmarkEnd w:id="46"/>
+    <w:bookmarkStart w:id="48" w:name="container-facilitator_confidence"/>
+    <w:bookmarkStart w:id="47" w:name="facilitator_confidence"/>
     <w:p>
       <w:pPr>
         <w:pStyle w:val="BodyText"/>
@@ -1004,7 +1026,7 @@
         <w:t xml:space="preserve">Very confident (5)</w:t>
       </w:r>
     </w:p>
-    <w:bookmarkEnd w:id="46"/>
+    <w:bookmarkEnd w:id="47"/>
     <w:p>
       <w:pPr>
         <w:pStyle w:val="BodyText"/>
@@ -1013,9 +1035,9 @@
         <w:t xml:space="preserve">*</w:t>
       </w:r>
     </w:p>
-    <w:bookmarkEnd w:id="47"/>
-    <w:bookmarkStart w:id="49" w:name="container-delivery_modules"/>
-    <w:bookmarkStart w:id="48" w:name="delivery_modules"/>
+    <w:bookmarkEnd w:id="48"/>
+    <w:bookmarkStart w:id="50" w:name="container-delivery_modules"/>
+    <w:bookmarkStart w:id="49" w:name="delivery_modules"/>
     <w:p>
       <w:pPr>
         <w:pStyle w:val="BodyText"/>
@@ -1112,7 +1134,7 @@
         <w:t xml:space="preserve">I do not intend to deliver this content</w:t>
       </w:r>
     </w:p>
-    <w:bookmarkEnd w:id="48"/>
+    <w:bookmarkEnd w:id="49"/>
     <w:p>
       <w:pPr>
         <w:pStyle w:val="BodyText"/>
@@ -1121,8 +1143,8 @@
         <w:t xml:space="preserve">*</w:t>
       </w:r>
     </w:p>
-    <w:bookmarkEnd w:id="49"/>
-    <w:bookmarkStart w:id="50" w:name="container-teaching_support"/>
+    <w:bookmarkEnd w:id="50"/>
+    <w:bookmarkStart w:id="51" w:name="container-teaching_support"/>
     <w:p>
       <w:pPr>
         <w:pStyle w:val="BodyText"/>
@@ -1139,8 +1161,8 @@
         <w:t xml:space="preserve">*</w:t>
       </w:r>
     </w:p>
-    <w:bookmarkEnd w:id="50"/>
-    <w:bookmarkStart w:id="51" w:name="container-delivery_barriers"/>
+    <w:bookmarkEnd w:id="51"/>
+    <w:bookmarkStart w:id="52" w:name="container-delivery_barriers"/>
     <w:p>
       <w:pPr>
         <w:pStyle w:val="BodyText"/>
@@ -1157,8 +1179,8 @@
         <w:t xml:space="preserve">*</w:t>
       </w:r>
     </w:p>
-    <w:bookmarkEnd w:id="51"/>
-    <w:bookmarkStart w:id="52" w:name="container-repeat_delivery"/>
+    <w:bookmarkEnd w:id="52"/>
+    <w:bookmarkStart w:id="53" w:name="container-repeat_delivery"/>
     <w:p>
       <w:pPr>
         <w:pStyle w:val="BodyText"/>
@@ -1175,8 +1197,8 @@
         <w:t xml:space="preserve">*</w:t>
       </w:r>
     </w:p>
-    <w:bookmarkEnd w:id="52"/>
-    <w:bookmarkStart w:id="53" w:name="container-educator_comments"/>
+    <w:bookmarkEnd w:id="53"/>
+    <w:bookmarkStart w:id="54" w:name="container-educator_comments"/>
     <w:p>
       <w:pPr>
         <w:pStyle w:val="BodyText"/>
@@ -1193,7 +1215,7 @@
         <w:t xml:space="preserve">*</w:t>
       </w:r>
     </w:p>
-    <w:bookmarkEnd w:id="53"/>
+    <w:bookmarkEnd w:id="54"/>
     <w:p>
       <w:pPr>
         <w:pStyle w:val="BodyText"/>
@@ -1265,8 +1287,8 @@
         <w:t xml:space="preserve">— studentpage</w:t>
       </w:r>
     </w:p>
-    <w:bookmarkEnd w:id="54"/>
-    <w:bookmarkStart w:id="80" w:name="your-experience-with-ai-gene-1"/>
+    <w:bookmarkEnd w:id="55"/>
+    <w:bookmarkStart w:id="81" w:name="your-experience-with-ai-gene-1"/>
     <w:p>
       <w:pPr>
         <w:pStyle w:val="Heading1"/>
@@ -1303,8 +1325,8 @@
         <w:t xml:space="preserve">other identifying information in your written responses.</w:t>
       </w:r>
     </w:p>
-    <w:bookmarkStart w:id="56" w:name="container-student_institution"/>
-    <w:bookmarkStart w:id="55" w:name="student_institution"/>
+    <w:bookmarkStart w:id="57" w:name="container-student_institution"/>
+    <w:bookmarkStart w:id="56" w:name="student_institution"/>
     <w:p>
       <w:pPr>
         <w:pStyle w:val="BodyText"/>
@@ -1369,7 +1391,7 @@
         <w:t xml:space="preserve">Other</w:t>
       </w:r>
     </w:p>
-    <w:bookmarkEnd w:id="55"/>
+    <w:bookmarkEnd w:id="56"/>
     <w:p>
       <w:pPr>
         <w:pStyle w:val="BodyText"/>
@@ -1378,8 +1400,8 @@
         <w:t xml:space="preserve">*</w:t>
       </w:r>
     </w:p>
-    <w:bookmarkEnd w:id="56"/>
-    <w:bookmarkStart w:id="57" w:name="container-student_institution_other"/>
+    <w:bookmarkEnd w:id="57"/>
+    <w:bookmarkStart w:id="58" w:name="container-student_institution_other"/>
     <w:p>
       <w:pPr>
         <w:pStyle w:val="BodyText"/>
@@ -1396,7 +1418,7 @@
         <w:t xml:space="preserve">*</w:t>
       </w:r>
     </w:p>
-    <w:bookmarkEnd w:id="57"/>
+    <w:bookmarkEnd w:id="58"/>
     <w:p>
       <w:pPr>
         <w:pStyle w:val="BodyText"/>
@@ -1425,8 +1447,8 @@
         <w:t xml:space="preserve">statement.</w:t>
       </w:r>
     </w:p>
-    <w:bookmarkStart w:id="59" w:name="container-student_lab_skills"/>
-    <w:bookmarkStart w:id="58" w:name="student_lab_skills"/>
+    <w:bookmarkStart w:id="60" w:name="container-student_lab_skills"/>
+    <w:bookmarkStart w:id="59" w:name="student_lab_skills"/>
     <w:p>
       <w:pPr>
         <w:pStyle w:val="BodyText"/>
@@ -1475,7 +1497,7 @@
         <w:t xml:space="preserve">Very much (5)</w:t>
       </w:r>
     </w:p>
-    <w:bookmarkEnd w:id="58"/>
+    <w:bookmarkEnd w:id="59"/>
     <w:p>
       <w:pPr>
         <w:pStyle w:val="BodyText"/>
@@ -1484,9 +1506,9 @@
         <w:t xml:space="preserve">*</w:t>
       </w:r>
     </w:p>
-    <w:bookmarkEnd w:id="59"/>
-    <w:bookmarkStart w:id="61" w:name="container-student_data_analysis"/>
-    <w:bookmarkStart w:id="60" w:name="student_data_analysis"/>
+    <w:bookmarkEnd w:id="60"/>
+    <w:bookmarkStart w:id="62" w:name="container-student_data_analysis"/>
+    <w:bookmarkStart w:id="61" w:name="student_data_analysis"/>
     <w:p>
       <w:pPr>
         <w:pStyle w:val="BodyText"/>
@@ -1535,7 +1557,7 @@
         <w:t xml:space="preserve">Very much (5)</w:t>
       </w:r>
     </w:p>
-    <w:bookmarkEnd w:id="60"/>
+    <w:bookmarkEnd w:id="61"/>
     <w:p>
       <w:pPr>
         <w:pStyle w:val="BodyText"/>
@@ -1544,9 +1566,9 @@
         <w:t xml:space="preserve">*</w:t>
       </w:r>
     </w:p>
-    <w:bookmarkEnd w:id="61"/>
-    <w:bookmarkStart w:id="63" w:name="container-student_genomics_tools"/>
-    <w:bookmarkStart w:id="62" w:name="student_genomics_tools"/>
+    <w:bookmarkEnd w:id="62"/>
+    <w:bookmarkStart w:id="64" w:name="container-student_genomics_tools"/>
+    <w:bookmarkStart w:id="63" w:name="student_genomics_tools"/>
     <w:p>
       <w:pPr>
         <w:pStyle w:val="BodyText"/>
@@ -1595,7 +1617,7 @@
         <w:t xml:space="preserve">Very much (5)</w:t>
       </w:r>
     </w:p>
-    <w:bookmarkEnd w:id="62"/>
+    <w:bookmarkEnd w:id="63"/>
     <w:p>
       <w:pPr>
         <w:pStyle w:val="BodyText"/>
@@ -1604,9 +1626,9 @@
         <w:t xml:space="preserve">*</w:t>
       </w:r>
     </w:p>
-    <w:bookmarkEnd w:id="63"/>
-    <w:bookmarkStart w:id="65" w:name="container-student_ai_tools"/>
-    <w:bookmarkStart w:id="64" w:name="student_ai_tools"/>
+    <w:bookmarkEnd w:id="64"/>
+    <w:bookmarkStart w:id="66" w:name="container-student_ai_tools"/>
+    <w:bookmarkStart w:id="65" w:name="student_ai_tools"/>
     <w:p>
       <w:pPr>
         <w:pStyle w:val="BodyText"/>
@@ -1655,7 +1677,7 @@
         <w:t xml:space="preserve">Very much (5)</w:t>
       </w:r>
     </w:p>
-    <w:bookmarkEnd w:id="64"/>
+    <w:bookmarkEnd w:id="65"/>
     <w:p>
       <w:pPr>
         <w:pStyle w:val="BodyText"/>
@@ -1664,9 +1686,9 @@
         <w:t xml:space="preserve">*</w:t>
       </w:r>
     </w:p>
-    <w:bookmarkEnd w:id="65"/>
-    <w:bookmarkStart w:id="67" w:name="container-student_metagenomics_knowledge"/>
-    <w:bookmarkStart w:id="66" w:name="student_metagenomics_knowledge"/>
+    <w:bookmarkEnd w:id="66"/>
+    <w:bookmarkStart w:id="68" w:name="container-student_metagenomics_knowledge"/>
+    <w:bookmarkStart w:id="67" w:name="student_metagenomics_knowledge"/>
     <w:p>
       <w:pPr>
         <w:pStyle w:val="BodyText"/>
@@ -1715,7 +1737,7 @@
         <w:t xml:space="preserve">Very much (5)</w:t>
       </w:r>
     </w:p>
-    <w:bookmarkEnd w:id="66"/>
+    <w:bookmarkEnd w:id="67"/>
     <w:p>
       <w:pPr>
         <w:pStyle w:val="BodyText"/>
@@ -1724,9 +1746,9 @@
         <w:t xml:space="preserve">*</w:t>
       </w:r>
     </w:p>
-    <w:bookmarkEnd w:id="67"/>
-    <w:bookmarkStart w:id="69" w:name="container-student_ai_knowledge"/>
-    <w:bookmarkStart w:id="68" w:name="student_ai_knowledge"/>
+    <w:bookmarkEnd w:id="68"/>
+    <w:bookmarkStart w:id="70" w:name="container-student_ai_knowledge"/>
+    <w:bookmarkStart w:id="69" w:name="student_ai_knowledge"/>
     <w:p>
       <w:pPr>
         <w:pStyle w:val="BodyText"/>
@@ -1775,7 +1797,7 @@
         <w:t xml:space="preserve">Very much (5)</w:t>
       </w:r>
     </w:p>
-    <w:bookmarkEnd w:id="68"/>
+    <w:bookmarkEnd w:id="69"/>
     <w:p>
       <w:pPr>
         <w:pStyle w:val="BodyText"/>
@@ -1784,9 +1806,9 @@
         <w:t xml:space="preserve">*</w:t>
       </w:r>
     </w:p>
-    <w:bookmarkEnd w:id="69"/>
-    <w:bookmarkStart w:id="71" w:name="container-student_genomics_curiosity"/>
-    <w:bookmarkStart w:id="70" w:name="student_genomics_curiosity"/>
+    <w:bookmarkEnd w:id="70"/>
+    <w:bookmarkStart w:id="72" w:name="container-student_genomics_curiosity"/>
+    <w:bookmarkStart w:id="71" w:name="student_genomics_curiosity"/>
     <w:p>
       <w:pPr>
         <w:pStyle w:val="BodyText"/>
@@ -1835,7 +1857,7 @@
         <w:t xml:space="preserve">Very much (5)</w:t>
       </w:r>
     </w:p>
-    <w:bookmarkEnd w:id="70"/>
+    <w:bookmarkEnd w:id="71"/>
     <w:p>
       <w:pPr>
         <w:pStyle w:val="BodyText"/>
@@ -1844,9 +1866,9 @@
         <w:t xml:space="preserve">*</w:t>
       </w:r>
     </w:p>
-    <w:bookmarkEnd w:id="71"/>
-    <w:bookmarkStart w:id="73" w:name="container-student_genomics_learning"/>
-    <w:bookmarkStart w:id="72" w:name="student_genomics_learning"/>
+    <w:bookmarkEnd w:id="72"/>
+    <w:bookmarkStart w:id="74" w:name="container-student_genomics_learning"/>
+    <w:bookmarkStart w:id="73" w:name="student_genomics_learning"/>
     <w:p>
       <w:pPr>
         <w:pStyle w:val="BodyText"/>
@@ -1895,7 +1917,7 @@
         <w:t xml:space="preserve">Very much (5)</w:t>
       </w:r>
     </w:p>
-    <w:bookmarkEnd w:id="72"/>
+    <w:bookmarkEnd w:id="73"/>
     <w:p>
       <w:pPr>
         <w:pStyle w:val="BodyText"/>
@@ -1904,9 +1926,9 @@
         <w:t xml:space="preserve">*</w:t>
       </w:r>
     </w:p>
-    <w:bookmarkEnd w:id="73"/>
-    <w:bookmarkStart w:id="75" w:name="X4e3b752dd0740ef2263948cb6dd8de83be3b01c"/>
-    <w:bookmarkStart w:id="74" w:name="student_ai_genomics_understanding"/>
+    <w:bookmarkEnd w:id="74"/>
+    <w:bookmarkStart w:id="76" w:name="X4e3b752dd0740ef2263948cb6dd8de83be3b01c"/>
+    <w:bookmarkStart w:id="75" w:name="student_ai_genomics_understanding"/>
     <w:p>
       <w:pPr>
         <w:pStyle w:val="BodyText"/>
@@ -1955,7 +1977,7 @@
         <w:t xml:space="preserve">Very much (5)</w:t>
       </w:r>
     </w:p>
-    <w:bookmarkEnd w:id="74"/>
+    <w:bookmarkEnd w:id="75"/>
     <w:p>
       <w:pPr>
         <w:pStyle w:val="BodyText"/>
@@ -1964,8 +1986,8 @@
         <w:t xml:space="preserve">*</w:t>
       </w:r>
     </w:p>
-    <w:bookmarkEnd w:id="75"/>
-    <w:bookmarkStart w:id="76" w:name="container-student_response_comments"/>
+    <w:bookmarkEnd w:id="76"/>
+    <w:bookmarkStart w:id="77" w:name="container-student_response_comments"/>
     <w:p>
       <w:pPr>
         <w:pStyle w:val="BodyText"/>
@@ -1982,8 +2004,8 @@
         <w:t xml:space="preserve">*</w:t>
       </w:r>
     </w:p>
-    <w:bookmarkEnd w:id="76"/>
-    <w:bookmarkStart w:id="77" w:name="container-student_engaging_parts"/>
+    <w:bookmarkEnd w:id="77"/>
+    <w:bookmarkStart w:id="78" w:name="container-student_engaging_parts"/>
     <w:p>
       <w:pPr>
         <w:pStyle w:val="BodyText"/>
@@ -2000,8 +2022,8 @@
         <w:t xml:space="preserve">*</w:t>
       </w:r>
     </w:p>
-    <w:bookmarkEnd w:id="77"/>
-    <w:bookmarkStart w:id="78" w:name="container-student_confusing_parts"/>
+    <w:bookmarkEnd w:id="78"/>
+    <w:bookmarkStart w:id="79" w:name="container-student_confusing_parts"/>
     <w:p>
       <w:pPr>
         <w:pStyle w:val="BodyText"/>
@@ -2018,8 +2040,8 @@
         <w:t xml:space="preserve">*</w:t>
       </w:r>
     </w:p>
-    <w:bookmarkEnd w:id="78"/>
-    <w:bookmarkStart w:id="79" w:name="X44c7119ddfd86bd971c30fa906d5183261162d4"/>
+    <w:bookmarkEnd w:id="79"/>
+    <w:bookmarkStart w:id="80" w:name="X44c7119ddfd86bd971c30fa906d5183261162d4"/>
     <w:p>
       <w:pPr>
         <w:pStyle w:val="BodyText"/>
@@ -2036,7 +2058,7 @@
         <w:t xml:space="preserve">*</w:t>
       </w:r>
     </w:p>
-    <w:bookmarkEnd w:id="79"/>
+    <w:bookmarkEnd w:id="80"/>
     <w:p>
       <w:pPr>
         <w:pStyle w:val="BodyText"/>
@@ -2108,8 +2130,8 @@
         <w:t xml:space="preserve">— staffpage</w:t>
       </w:r>
     </w:p>
-    <w:bookmarkEnd w:id="80"/>
-    <w:bookmarkStart w:id="106" w:name="your-experience-with-ai-gene-2"/>
+    <w:bookmarkEnd w:id="81"/>
+    <w:bookmarkStart w:id="107" w:name="your-experience-with-ai-gene-2"/>
     <w:p>
       <w:pPr>
         <w:pStyle w:val="Heading1"/>
@@ -2146,8 +2168,8 @@
         <w:t xml:space="preserve">other identifying information in your written responses.</w:t>
       </w:r>
     </w:p>
-    <w:bookmarkStart w:id="82" w:name="container-affiliate_institution"/>
-    <w:bookmarkStart w:id="81" w:name="affiliate_institution"/>
+    <w:bookmarkStart w:id="83" w:name="container-affiliate_institution"/>
+    <w:bookmarkStart w:id="82" w:name="affiliate_institution"/>
     <w:p>
       <w:pPr>
         <w:pStyle w:val="BodyText"/>
@@ -2228,7 +2250,7 @@
         <w:t xml:space="preserve">Other</w:t>
       </w:r>
     </w:p>
-    <w:bookmarkEnd w:id="81"/>
+    <w:bookmarkEnd w:id="82"/>
     <w:p>
       <w:pPr>
         <w:pStyle w:val="BodyText"/>
@@ -2237,8 +2259,8 @@
         <w:t xml:space="preserve">*</w:t>
       </w:r>
     </w:p>
-    <w:bookmarkEnd w:id="82"/>
-    <w:bookmarkStart w:id="83" w:name="container-affiliate_institution_other"/>
+    <w:bookmarkEnd w:id="83"/>
+    <w:bookmarkStart w:id="84" w:name="container-affiliate_institution_other"/>
     <w:p>
       <w:pPr>
         <w:pStyle w:val="BodyText"/>
@@ -2255,7 +2277,7 @@
         <w:t xml:space="preserve">*</w:t>
       </w:r>
     </w:p>
-    <w:bookmarkEnd w:id="83"/>
+    <w:bookmarkEnd w:id="84"/>
     <w:p>
       <w:pPr>
         <w:pStyle w:val="BodyText"/>
@@ -2284,8 +2306,8 @@
         <w:t xml:space="preserve">statement.</w:t>
       </w:r>
     </w:p>
-    <w:bookmarkStart w:id="85" w:name="container-affiliate_lab_skills"/>
-    <w:bookmarkStart w:id="84" w:name="affiliate_lab_skills"/>
+    <w:bookmarkStart w:id="86" w:name="container-affiliate_lab_skills"/>
+    <w:bookmarkStart w:id="85" w:name="affiliate_lab_skills"/>
     <w:p>
       <w:pPr>
         <w:pStyle w:val="BodyText"/>
@@ -2334,7 +2356,7 @@
         <w:t xml:space="preserve">Very much (5)</w:t>
       </w:r>
     </w:p>
-    <w:bookmarkEnd w:id="84"/>
+    <w:bookmarkEnd w:id="85"/>
     <w:p>
       <w:pPr>
         <w:pStyle w:val="BodyText"/>
@@ -2343,9 +2365,9 @@
         <w:t xml:space="preserve">*</w:t>
       </w:r>
     </w:p>
-    <w:bookmarkEnd w:id="85"/>
-    <w:bookmarkStart w:id="87" w:name="container-affiliate_data_analysis"/>
-    <w:bookmarkStart w:id="86" w:name="affiliate_data_analysis"/>
+    <w:bookmarkEnd w:id="86"/>
+    <w:bookmarkStart w:id="88" w:name="container-affiliate_data_analysis"/>
+    <w:bookmarkStart w:id="87" w:name="affiliate_data_analysis"/>
     <w:p>
       <w:pPr>
         <w:pStyle w:val="BodyText"/>
@@ -2394,7 +2416,7 @@
         <w:t xml:space="preserve">Very much (5)</w:t>
       </w:r>
     </w:p>
-    <w:bookmarkEnd w:id="86"/>
+    <w:bookmarkEnd w:id="87"/>
     <w:p>
       <w:pPr>
         <w:pStyle w:val="BodyText"/>
@@ -2403,9 +2425,9 @@
         <w:t xml:space="preserve">*</w:t>
       </w:r>
     </w:p>
-    <w:bookmarkEnd w:id="87"/>
-    <w:bookmarkStart w:id="89" w:name="container-affiliate_genomics_tools"/>
-    <w:bookmarkStart w:id="88" w:name="affiliate_genomics_tools"/>
+    <w:bookmarkEnd w:id="88"/>
+    <w:bookmarkStart w:id="90" w:name="container-affiliate_genomics_tools"/>
+    <w:bookmarkStart w:id="89" w:name="affiliate_genomics_tools"/>
     <w:p>
       <w:pPr>
         <w:pStyle w:val="BodyText"/>
@@ -2454,7 +2476,7 @@
         <w:t xml:space="preserve">Very much (5)</w:t>
       </w:r>
     </w:p>
-    <w:bookmarkEnd w:id="88"/>
+    <w:bookmarkEnd w:id="89"/>
     <w:p>
       <w:pPr>
         <w:pStyle w:val="BodyText"/>
@@ -2463,9 +2485,9 @@
         <w:t xml:space="preserve">*</w:t>
       </w:r>
     </w:p>
-    <w:bookmarkEnd w:id="89"/>
-    <w:bookmarkStart w:id="91" w:name="container-affiliate_ai_tools"/>
-    <w:bookmarkStart w:id="90" w:name="affiliate_ai_tools"/>
+    <w:bookmarkEnd w:id="90"/>
+    <w:bookmarkStart w:id="92" w:name="container-affiliate_ai_tools"/>
+    <w:bookmarkStart w:id="91" w:name="affiliate_ai_tools"/>
     <w:p>
       <w:pPr>
         <w:pStyle w:val="BodyText"/>
@@ -2514,7 +2536,7 @@
         <w:t xml:space="preserve">Very much (5)</w:t>
       </w:r>
     </w:p>
-    <w:bookmarkEnd w:id="90"/>
+    <w:bookmarkEnd w:id="91"/>
     <w:p>
       <w:pPr>
         <w:pStyle w:val="BodyText"/>
@@ -2523,9 +2545,9 @@
         <w:t xml:space="preserve">*</w:t>
       </w:r>
     </w:p>
-    <w:bookmarkEnd w:id="91"/>
-    <w:bookmarkStart w:id="93" w:name="Xcedb5bd69c8c86ae262314c3aaa6fc2584584c9"/>
-    <w:bookmarkStart w:id="92" w:name="affiliate_metagenomics_knowledge"/>
+    <w:bookmarkEnd w:id="92"/>
+    <w:bookmarkStart w:id="94" w:name="Xcedb5bd69c8c86ae262314c3aaa6fc2584584c9"/>
+    <w:bookmarkStart w:id="93" w:name="affiliate_metagenomics_knowledge"/>
     <w:p>
       <w:pPr>
         <w:pStyle w:val="BodyText"/>
@@ -2574,7 +2596,7 @@
         <w:t xml:space="preserve">Very much (5)</w:t>
       </w:r>
     </w:p>
-    <w:bookmarkEnd w:id="92"/>
+    <w:bookmarkEnd w:id="93"/>
     <w:p>
       <w:pPr>
         <w:pStyle w:val="BodyText"/>
@@ -2583,9 +2605,9 @@
         <w:t xml:space="preserve">*</w:t>
       </w:r>
     </w:p>
-    <w:bookmarkEnd w:id="93"/>
-    <w:bookmarkStart w:id="95" w:name="container-affiliate_ai_knowledge"/>
-    <w:bookmarkStart w:id="94" w:name="affiliate_ai_knowledge"/>
+    <w:bookmarkEnd w:id="94"/>
+    <w:bookmarkStart w:id="96" w:name="container-affiliate_ai_knowledge"/>
+    <w:bookmarkStart w:id="95" w:name="affiliate_ai_knowledge"/>
     <w:p>
       <w:pPr>
         <w:pStyle w:val="BodyText"/>
@@ -2634,7 +2656,7 @@
         <w:t xml:space="preserve">Very much (5)</w:t>
       </w:r>
     </w:p>
-    <w:bookmarkEnd w:id="94"/>
+    <w:bookmarkEnd w:id="95"/>
     <w:p>
       <w:pPr>
         <w:pStyle w:val="BodyText"/>
@@ -2643,9 +2665,9 @@
         <w:t xml:space="preserve">*</w:t>
       </w:r>
     </w:p>
-    <w:bookmarkEnd w:id="95"/>
-    <w:bookmarkStart w:id="97" w:name="container-affiliate_genomics_curiosity"/>
-    <w:bookmarkStart w:id="96" w:name="affiliate_genomics_curiosity"/>
+    <w:bookmarkEnd w:id="96"/>
+    <w:bookmarkStart w:id="98" w:name="container-affiliate_genomics_curiosity"/>
+    <w:bookmarkStart w:id="97" w:name="affiliate_genomics_curiosity"/>
     <w:p>
       <w:pPr>
         <w:pStyle w:val="BodyText"/>
@@ -2694,7 +2716,7 @@
         <w:t xml:space="preserve">Very much (5)</w:t>
       </w:r>
     </w:p>
-    <w:bookmarkEnd w:id="96"/>
+    <w:bookmarkEnd w:id="97"/>
     <w:p>
       <w:pPr>
         <w:pStyle w:val="BodyText"/>
@@ -2703,9 +2725,9 @@
         <w:t xml:space="preserve">*</w:t>
       </w:r>
     </w:p>
-    <w:bookmarkEnd w:id="97"/>
-    <w:bookmarkStart w:id="99" w:name="container-affiliate_genomics_learning"/>
-    <w:bookmarkStart w:id="98" w:name="affiliate_genomics_learning"/>
+    <w:bookmarkEnd w:id="98"/>
+    <w:bookmarkStart w:id="100" w:name="container-affiliate_genomics_learning"/>
+    <w:bookmarkStart w:id="99" w:name="affiliate_genomics_learning"/>
     <w:p>
       <w:pPr>
         <w:pStyle w:val="BodyText"/>
@@ -2754,7 +2776,7 @@
         <w:t xml:space="preserve">Very much (5)</w:t>
       </w:r>
     </w:p>
-    <w:bookmarkEnd w:id="98"/>
+    <w:bookmarkEnd w:id="99"/>
     <w:p>
       <w:pPr>
         <w:pStyle w:val="BodyText"/>
@@ -2763,9 +2785,9 @@
         <w:t xml:space="preserve">*</w:t>
       </w:r>
     </w:p>
-    <w:bookmarkEnd w:id="99"/>
-    <w:bookmarkStart w:id="101" w:name="X943bd48d4eeeb8abc06e1eb18e4fad381c20bab"/>
-    <w:bookmarkStart w:id="100" w:name="affiliate_ai_genomics_understanding"/>
+    <w:bookmarkEnd w:id="100"/>
+    <w:bookmarkStart w:id="102" w:name="X943bd48d4eeeb8abc06e1eb18e4fad381c20bab"/>
+    <w:bookmarkStart w:id="101" w:name="affiliate_ai_genomics_understanding"/>
     <w:p>
       <w:pPr>
         <w:pStyle w:val="BodyText"/>
@@ -2814,7 +2836,7 @@
         <w:t xml:space="preserve">Very much (5)</w:t>
       </w:r>
     </w:p>
-    <w:bookmarkEnd w:id="100"/>
+    <w:bookmarkEnd w:id="101"/>
     <w:p>
       <w:pPr>
         <w:pStyle w:val="BodyText"/>
@@ -2823,8 +2845,8 @@
         <w:t xml:space="preserve">*</w:t>
       </w:r>
     </w:p>
-    <w:bookmarkEnd w:id="101"/>
-    <w:bookmarkStart w:id="102" w:name="container-affiliate_response_comments"/>
+    <w:bookmarkEnd w:id="102"/>
+    <w:bookmarkStart w:id="103" w:name="container-affiliate_response_comments"/>
     <w:p>
       <w:pPr>
         <w:pStyle w:val="BodyText"/>
@@ -2841,8 +2863,8 @@
         <w:t xml:space="preserve">*</w:t>
       </w:r>
     </w:p>
-    <w:bookmarkEnd w:id="102"/>
-    <w:bookmarkStart w:id="103" w:name="container-affiliate_engaging_parts"/>
+    <w:bookmarkEnd w:id="103"/>
+    <w:bookmarkStart w:id="104" w:name="container-affiliate_engaging_parts"/>
     <w:p>
       <w:pPr>
         <w:pStyle w:val="BodyText"/>
@@ -2859,8 +2881,8 @@
         <w:t xml:space="preserve">*</w:t>
       </w:r>
     </w:p>
-    <w:bookmarkEnd w:id="103"/>
-    <w:bookmarkStart w:id="104" w:name="container-affiliate_confusing_parts"/>
+    <w:bookmarkEnd w:id="104"/>
+    <w:bookmarkStart w:id="105" w:name="container-affiliate_confusing_parts"/>
     <w:p>
       <w:pPr>
         <w:pStyle w:val="BodyText"/>
@@ -2877,8 +2899,8 @@
         <w:t xml:space="preserve">*</w:t>
       </w:r>
     </w:p>
-    <w:bookmarkEnd w:id="104"/>
-    <w:bookmarkStart w:id="105" w:name="X58150152a8c3477866809cb8631ded569bf679b"/>
+    <w:bookmarkEnd w:id="105"/>
+    <w:bookmarkStart w:id="106" w:name="X58150152a8c3477866809cb8631ded569bf679b"/>
     <w:p>
       <w:pPr>
         <w:pStyle w:val="BodyText"/>
@@ -2895,7 +2917,7 @@
         <w:t xml:space="preserve">*</w:t>
       </w:r>
     </w:p>
-    <w:bookmarkEnd w:id="105"/>
+    <w:bookmarkEnd w:id="106"/>
     <w:p>
       <w:pPr>
         <w:pStyle w:val="BodyText"/>
@@ -3018,7 +3040,7 @@
         <w:t xml:space="preserve">Exit Survey</w:t>
       </w:r>
     </w:p>
-    <w:bookmarkEnd w:id="106"/>
+    <w:bookmarkEnd w:id="107"/>
     <w:sectPr/>
   </w:body>
 </w:document>

</xml_diff>